<commit_message>
Let Agility resume run to two pages instead of forcing one
Comfortable spacing/font restored; page break now falls after Mendix
Copywriter, so Bolt.new through Mendix (the most relevant six years) reads
as one clean page and Iron Mountain/Internet Brands trail to page two.
Restored two bullets (B2B/B2C dual-audience, $1M budget) that were only
cut earlier to force a one-page fit.

Co-Authored-By: Claude Sonnet 5 <noreply@anthropic.com>
Claude-Session: https://claude.ai/code/session_01HGwMf3WQEWpBH5LDYWi1id
</commit_message>
<xml_diff>
--- a/Taylor-Bornstein-Resume-Agility-Robotics.docx
+++ b/Taylor-Bornstein-Resume-Agility-Robotics.docx
@@ -95,7 +95,7 @@
         <w:tabs>
           <w:tab w:val="right" w:pos="10800"/>
         </w:tabs>
-        <w:spacing w:after="20" w:before="100"/>
+        <w:spacing w:after="20" w:before="140"/>
       </w:pPr>
       <w:r>
         <w:rPr>
@@ -206,6 +206,24 @@
           <w:sz w:val="20"/>
           <w:szCs w:val="20"/>
         </w:rPr>
+        <w:t xml:space="preserve">Set content strategy across B2B and B2C messaging and built a customer story pipeline from original customer research.</w:t>
+      </w:r>
+    </w:p>
+    <w:p>
+      <w:pPr>
+        <w:pStyle w:val="ListParagraph"/>
+        <w:numPr>
+          <w:ilvl w:val="0"/>
+          <w:numId w:val="2"/>
+        </w:numPr>
+        <w:spacing w:after="40" w:before="0"/>
+      </w:pPr>
+      <w:r>
+        <w:rPr>
+          <w:rFonts w:ascii="Noto Sans" w:cs="Noto Sans" w:eastAsia="Noto Sans" w:hAnsi="Noto Sans"/>
+          <w:sz w:val="20"/>
+          <w:szCs w:val="20"/>
+        </w:rPr>
         <w:t xml:space="preserve">Launched a new blog and increased publication cadence from 1–2 posts/month to 3–4/week; personally writes and edits ongoing posts, customer stories, and web copy while setting the strategy the rest of the team builds against.</w:t>
       </w:r>
     </w:p>
@@ -214,7 +232,7 @@
         <w:tabs>
           <w:tab w:val="right" w:pos="10800"/>
         </w:tabs>
-        <w:spacing w:after="20" w:before="100"/>
+        <w:spacing w:after="20" w:before="140"/>
       </w:pPr>
       <w:r>
         <w:rPr>
@@ -294,10 +312,28 @@
     </w:p>
     <w:p>
       <w:pPr>
+        <w:pStyle w:val="ListParagraph"/>
+        <w:numPr>
+          <w:ilvl w:val="0"/>
+          <w:numId w:val="2"/>
+        </w:numPr>
+        <w:spacing w:after="40" w:before="0"/>
+      </w:pPr>
+      <w:r>
+        <w:rPr>
+          <w:rFonts w:ascii="Noto Sans" w:cs="Noto Sans" w:eastAsia="Noto Sans" w:hAnsi="Noto Sans"/>
+          <w:sz w:val="20"/>
+          <w:szCs w:val="20"/>
+        </w:rPr>
+        <w:t xml:space="preserve">Optimized a $1M annual budget, reallocating toward high-impact initiatives.</w:t>
+      </w:r>
+    </w:p>
+    <w:p>
+      <w:pPr>
         <w:tabs>
           <w:tab w:val="right" w:pos="10800"/>
         </w:tabs>
-        <w:spacing w:after="20" w:before="100"/>
+        <w:spacing w:after="20" w:before="140"/>
       </w:pPr>
       <w:r>
         <w:rPr>
@@ -344,7 +380,7 @@
         <w:tabs>
           <w:tab w:val="right" w:pos="10800"/>
         </w:tabs>
-        <w:spacing w:after="20" w:before="100"/>
+        <w:spacing w:after="20" w:before="140"/>
       </w:pPr>
       <w:r>
         <w:rPr>
@@ -391,7 +427,7 @@
         <w:tabs>
           <w:tab w:val="right" w:pos="10800"/>
         </w:tabs>
-        <w:spacing w:after="20" w:before="100"/>
+        <w:spacing w:after="20" w:before="140"/>
       </w:pPr>
       <w:r>
         <w:rPr>
@@ -438,7 +474,7 @@
         <w:tabs>
           <w:tab w:val="right" w:pos="10800"/>
         </w:tabs>
-        <w:spacing w:after="20" w:before="100"/>
+        <w:spacing w:after="20" w:before="140"/>
       </w:pPr>
       <w:r>
         <w:rPr>
@@ -485,7 +521,7 @@
         <w:tabs>
           <w:tab w:val="right" w:pos="10800"/>
         </w:tabs>
-        <w:spacing w:after="20" w:before="100"/>
+        <w:spacing w:after="20" w:before="140"/>
       </w:pPr>
       <w:r>
         <w:rPr>

</xml_diff>